<commit_message>
Progress on beginning, wes helps with mash, grimwalt sees snipe
</commit_message>
<xml_diff>
--- a/Content/Arrangement/1 - Twenty-seventhousandJarsOfDeliciousChocolateHazelnutSpread - Copy.docx
+++ b/Content/Arrangement/1 - Twenty-seventhousandJarsOfDeliciousChocolateHazelnutSpread - Copy.docx
@@ -2097,7 +2097,12 @@
       </w:r>
       <w:proofErr w:type="spellEnd"/>
       <w:r>
-        <w:t xml:space="preserve"> Noose if you buy it at Mighty Mart and Nature Fare and Hazelnut Crème if you buy it at Earth Market.</w:t>
+        <w:t xml:space="preserve"> Noose if you buy it at Mighty Mart and </w:t>
+      </w:r>
+    </w:p>
+    <w:p>
+      <w:r>
+        <w:t>Nature Fare and Hazelnut Crème if you buy it at Earth Market.</w:t>
       </w:r>
     </w:p>
     <w:p>

</xml_diff>